<commit_message>
Add worked solutions for GET 311 application questions
Markdown solutions for all 128 questions (8 topics x 8 departments x 2),
numerical answers checked with SymPy, plus a Word version that shows each
question above its solution. Also regenerate the questions .docx to fix
italics wrongly applied to "(L*, a*, b*)".

Co-Authored-By: Claude Opus 5.5 <noreply@anthropic.com>
Claude-Session: https://claude.ai/code/session_01VjQJQeR2CGKm59KnocfKn5
</commit_message>
<xml_diff>
--- a/GET311-Engineering-Mathematics-III/GET311-Engineering-Mathematics-III.docx
+++ b/GET311-Engineering-Mathematics-III/GET311-Engineering-Mathematics-III.docx
@@ -188,6 +188,52 @@
       </w:r>
       <w:r>
         <w:t xml:space="preserve"> that take the course (16 questions per topic, 128 in total).</w:t>
+      </w:r>
+    </w:p>
+    <w:p>
+      <w:pPr>
+        <w:spacing w:after="120"/>
+      </w:pPr>
+      <w:r>
+        <w:t xml:space="preserve">Worked solutions to all 128 questions are in the </w:t>
+      </w:r>
+      <w:r>
+        <w:t xml:space="preserve">`solutions/`</w:t>
+      </w:r>
+      <w:r>
+        <w:t xml:space="preserve"> folder.</w:t>
+      </w:r>
+    </w:p>
+    <w:p>
+      <w:pPr>
+        <w:spacing w:after="120"/>
+      </w:pPr>
+      <w:r>
+        <w:t xml:space="preserve">Both are also available as Word documents:</w:t>
+      </w:r>
+    </w:p>
+    <w:p>
+      <w:pPr>
+        <w:pStyle w:val="ListParagraph"/>
+        <w:numPr>
+          <w:ilvl w:val="0"/>
+          <w:numId w:val="2"/>
+        </w:numPr>
+      </w:pPr>
+      <w:r>
+        <w:t xml:space="preserve">`GET311-Engineering-Mathematics-III.docx`: the topic introductions and questions.</w:t>
+      </w:r>
+    </w:p>
+    <w:p>
+      <w:pPr>
+        <w:pStyle w:val="ListParagraph"/>
+        <w:numPr>
+          <w:ilvl w:val="0"/>
+          <w:numId w:val="2"/>
+        </w:numPr>
+      </w:pPr>
+      <w:r>
+        <w:t xml:space="preserve">`GET311-Engineering-Mathematics-III-Solutions.docx`: the worked solutions, each shown under its question.</w:t>
       </w:r>
     </w:p>
     <w:p>
@@ -1650,17 +1696,7 @@
         <w:spacing w:after="120"/>
       </w:pPr>
       <w:r>
-        <w:t xml:space="preserve">The colour of a juice is measured in (L</w:t>
-      </w:r>
-      <w:r>
-        <w:rPr>
-          <w:i/>
-          <w:iCs/>
-        </w:rPr>
-        <w:t xml:space="preserve">, a</w:t>
-      </w:r>
-      <w:r>
-        <w:t xml:space="preserve">, b*) colour space. The target is (45, 20, 30) and a batch measures (42, 24, 27). Compute the colour difference ΔE as a Euclidean norm, and the unit vector giving the direction of the colour error.</w:t>
+        <w:t xml:space="preserve">The colour of a juice is measured in (L*, a*, b*) colour space. The target is (45, 20, 30) and a batch measures (42, 24, 27). Compute the colour difference ΔE as a Euclidean norm, and the unit vector giving the direction of the colour error.</w:t>
       </w:r>
     </w:p>
     <w:p>

</xml_diff>